<commit_message>
Trim the repository for submission
Remove run bookkeeping that is not needed to read, build or re-run the
study: results/raw/ (per-chunk CSVs, merged in results.csv), results/logs/,
results/discarded/ and results/.gitkeep. All of it stays in the history at
0d9841c. results/raw/ is now git-ignored because run_study.py recreates it.
README and the report point to that commit for the discarded data.

Co-Authored-By: Claude Opus 5.5 <noreply@anthropic.com>
</commit_message>
<xml_diff>
--- a/report/PA1_Report_Union_Find.docx
+++ b/report/PA1_Report_Union_Find.docx
@@ -6424,7 +6424,21 @@
         <w:rPr>
           <w:rFonts w:ascii="Calibri" w:cs="Calibri" w:eastAsia="Calibri" w:hAnsi="Calibri"/>
         </w:rPr>
-        <w:t xml:space="preserve"> The first full run was split by an 11-hour laptop sleep, and its results were noisier. Every chunk in the final dataset was re-measured in one continuous session; the discarded data is kept in the repository with the reasons. The re-measured work counts were identical to the first session's, and times agreed to a median of 2%.</w:t>
+        <w:t xml:space="preserve"> The first full run was split by an 11-hour laptop sleep, and its results were noisier. Every chunk in the final dataset was re-measured in one continuous session; the discarded data and the reasons for each case are preserved in the repository's history (commit </w:t>
+      </w:r>
+      <w:r>
+        <w:rPr>
+          <w:rFonts w:ascii="Consolas" w:cs="Consolas" w:eastAsia="Consolas" w:hAnsi="Consolas"/>
+          <w:sz w:val="19"/>
+          <w:szCs w:val="19"/>
+        </w:rPr>
+        <w:t xml:space="preserve">0d9841c</w:t>
+      </w:r>
+      <w:r>
+        <w:rPr>
+          <w:rFonts w:ascii="Calibri" w:cs="Calibri" w:eastAsia="Calibri" w:hAnsi="Calibri"/>
+        </w:rPr>
+        <w:t xml:space="preserve">). The re-measured work counts were identical to the first session's, and times agreed to a median of 2%.</w:t>
       </w:r>
     </w:p>
     <w:p>

</xml_diff>